<commit_message>
Improve report tables and analysis
</commit_message>
<xml_diff>
--- a/template.docx
+++ b/template.docx
@@ -594,27 +594,75 @@
           <w:rFonts w:ascii="Arial" w:hAnsi="Arial" w:cs="Arial"/>
           <w:color w:val="1A1A1A"/>
           <w:shd w:val="clear" w:color="auto" w:fill="FFFFFF"/>
-          <w:lang w:val="en-US"/>
-        </w:rPr>
-      </w:pPr>
-      <w:r>
-        <w:rPr>
-          <w:rFonts w:ascii="Arial" w:hAnsi="Arial" w:cs="Arial"/>
-          <w:color w:val="1A1A1A"/>
-          <w:shd w:val="clear" w:color="auto" w:fill="FFFFFF"/>
-          <w:lang w:val="en-US"/>
+        </w:rPr>
+      </w:pPr>
+      <w:r>
+        <w:rPr>
+          <w:rFonts w:ascii="Arial" w:hAnsi="Arial" w:cs="Arial"/>
+          <w:color w:val="1A1A1A"/>
+          <w:shd w:val="clear" w:color="auto" w:fill="FFFFFF"/>
         </w:rPr>
         <w:lastRenderedPageBreak/>
-        <w:t>{{INPUT_DATA_TABLE}}</w:t>
-      </w:r>
-    </w:p>
-    <w:p>
-      <w:pPr>
-        <w:rPr>
-          <w:rFonts w:ascii="Arial" w:hAnsi="Arial" w:cs="Arial"/>
-          <w:color w:val="1A1A1A"/>
-          <w:shd w:val="clear" w:color="auto" w:fill="FFFFFF"/>
-          <w:lang w:val="en-US"/>
+        <w:t>{{</w:t>
+      </w:r>
+      <w:r>
+        <w:rPr>
+          <w:rFonts w:ascii="Arial" w:hAnsi="Arial" w:cs="Arial"/>
+          <w:color w:val="1A1A1A"/>
+          <w:shd w:val="clear" w:color="auto" w:fill="FFFFFF"/>
+          <w:lang w:val="en-US"/>
+        </w:rPr>
+        <w:t>INPUT</w:t>
+      </w:r>
+      <w:r>
+        <w:rPr>
+          <w:rFonts w:ascii="Arial" w:hAnsi="Arial" w:cs="Arial"/>
+          <w:color w:val="1A1A1A"/>
+          <w:shd w:val="clear" w:color="auto" w:fill="FFFFFF"/>
+        </w:rPr>
+        <w:t>_</w:t>
+      </w:r>
+      <w:r>
+        <w:rPr>
+          <w:rFonts w:ascii="Arial" w:hAnsi="Arial" w:cs="Arial"/>
+          <w:color w:val="1A1A1A"/>
+          <w:shd w:val="clear" w:color="auto" w:fill="FFFFFF"/>
+          <w:lang w:val="en-US"/>
+        </w:rPr>
+        <w:t>DATA</w:t>
+      </w:r>
+      <w:r>
+        <w:rPr>
+          <w:rFonts w:ascii="Arial" w:hAnsi="Arial" w:cs="Arial"/>
+          <w:color w:val="1A1A1A"/>
+          <w:shd w:val="clear" w:color="auto" w:fill="FFFFFF"/>
+        </w:rPr>
+        <w:t>_</w:t>
+      </w:r>
+      <w:r>
+        <w:rPr>
+          <w:rFonts w:ascii="Arial" w:hAnsi="Arial" w:cs="Arial"/>
+          <w:color w:val="1A1A1A"/>
+          <w:shd w:val="clear" w:color="auto" w:fill="FFFFFF"/>
+          <w:lang w:val="en-US"/>
+        </w:rPr>
+        <w:t>TABLE</w:t>
+      </w:r>
+      <w:r>
+        <w:rPr>
+          <w:rFonts w:ascii="Arial" w:hAnsi="Arial" w:cs="Arial"/>
+          <w:color w:val="1A1A1A"/>
+          <w:shd w:val="clear" w:color="auto" w:fill="FFFFFF"/>
+        </w:rPr>
+        <w:t>}}</w:t>
+      </w:r>
+    </w:p>
+    <w:p>
+      <w:pPr>
+        <w:rPr>
+          <w:rFonts w:ascii="Arial" w:hAnsi="Arial" w:cs="Arial"/>
+          <w:color w:val="1A1A1A"/>
+          <w:shd w:val="clear" w:color="auto" w:fill="FFFFFF"/>
         </w:rPr>
       </w:pPr>
     </w:p>
@@ -2191,8 +2239,282 @@
       <w:pPr>
         <w:rPr>
           <w:rFonts w:ascii="Arial" w:hAnsi="Arial" w:cs="Arial"/>
-          <w:b/>
-          <w:bCs/>
+          <w:color w:val="1A1A1A"/>
+          <w:shd w:val="clear" w:color="auto" w:fill="FFFFFF"/>
+          <w:lang w:val="en-US"/>
+        </w:rPr>
+      </w:pPr>
+    </w:p>
+    <w:p>
+      <w:pPr>
+        <w:rPr>
+          <w:rFonts w:ascii="Arial" w:hAnsi="Arial" w:cs="Arial"/>
+          <w:b/>
+          <w:bCs/>
+          <w:color w:val="1A1A1A"/>
+          <w:shd w:val="clear" w:color="auto" w:fill="FFFFFF"/>
+          <w:lang w:val="en-US"/>
+        </w:rPr>
+      </w:pPr>
+      <w:r>
+        <w:rPr>
+          <w:rFonts w:ascii="Arial" w:hAnsi="Arial" w:cs="Arial"/>
+          <w:b/>
+          <w:bCs/>
+          <w:color w:val="1A1A1A"/>
+          <w:shd w:val="clear" w:color="auto" w:fill="FFFFFF"/>
+        </w:rPr>
+        <w:t>ДН</w:t>
+      </w:r>
+    </w:p>
+    <w:p>
+      <w:pPr>
+        <w:rPr>
+          <w:rFonts w:ascii="Arial" w:hAnsi="Arial" w:cs="Arial"/>
+          <w:color w:val="1A1A1A"/>
+          <w:shd w:val="clear" w:color="auto" w:fill="FFFFFF"/>
+          <w:lang w:val="en-US"/>
+        </w:rPr>
+      </w:pPr>
+      <w:r>
+        <w:rPr>
+          <w:rFonts w:ascii="Arial" w:hAnsi="Arial" w:cs="Arial"/>
+          <w:color w:val="1A1A1A"/>
+          <w:lang w:val="en-US"/>
+        </w:rPr>
+        <w:br/>
+      </w:r>
+      <w:r>
+        <w:rPr>
+          <w:rFonts w:ascii="Arial" w:hAnsi="Arial" w:cs="Arial"/>
+          <w:color w:val="1A1A1A"/>
+          <w:lang w:val="en-US"/>
+        </w:rPr>
+        <w:br/>
+      </w:r>
+      <w:r>
+        <w:rPr>
+          <w:rFonts w:ascii="Arial" w:hAnsi="Arial" w:cs="Arial"/>
+          <w:color w:val="1A1A1A"/>
+          <w:shd w:val="clear" w:color="auto" w:fill="FFFFFF"/>
+          <w:lang w:val="en-US"/>
+        </w:rPr>
+        <w:t>{{GRAPH_DN_AZIMUTH}}</w:t>
+      </w:r>
+    </w:p>
+    <w:p>
+      <w:pPr>
+        <w:rPr>
+          <w:rFonts w:ascii="Arial" w:hAnsi="Arial" w:cs="Arial"/>
+          <w:color w:val="1A1A1A"/>
+          <w:shd w:val="clear" w:color="auto" w:fill="FFFFFF"/>
+          <w:lang w:val="en-US"/>
+        </w:rPr>
+      </w:pPr>
+      <w:r>
+        <w:rPr>
+          <w:rFonts w:ascii="Arial" w:hAnsi="Arial" w:cs="Arial"/>
+          <w:color w:val="1A1A1A"/>
+          <w:lang w:val="en-US"/>
+        </w:rPr>
+        <w:br/>
+      </w:r>
+      <w:r>
+        <w:rPr>
+          <w:rFonts w:ascii="Arial" w:hAnsi="Arial" w:cs="Arial"/>
+          <w:color w:val="1A1A1A"/>
+          <w:shd w:val="clear" w:color="auto" w:fill="FFFFFF"/>
+          <w:lang w:val="en-US"/>
+        </w:rPr>
+        <w:t>{{GRAPH_DN_ELEVATION}}</w:t>
+      </w:r>
+    </w:p>
+    <w:p>
+      <w:pPr>
+        <w:rPr>
+          <w:rFonts w:ascii="Arial" w:hAnsi="Arial" w:cs="Arial"/>
+          <w:color w:val="1A1A1A"/>
+          <w:shd w:val="clear" w:color="auto" w:fill="FFFFFF"/>
+          <w:lang w:val="en-US"/>
+        </w:rPr>
+      </w:pPr>
+      <w:r>
+        <w:rPr>
+          <w:rFonts w:ascii="Arial" w:hAnsi="Arial" w:cs="Arial"/>
+          <w:color w:val="1A1A1A"/>
+          <w:lang w:val="en-US"/>
+        </w:rPr>
+        <w:br/>
+      </w:r>
+      <w:r>
+        <w:rPr>
+          <w:rFonts w:ascii="Arial" w:hAnsi="Arial" w:cs="Arial"/>
+          <w:color w:val="1A1A1A"/>
+          <w:shd w:val="clear" w:color="auto" w:fill="FFFFFF"/>
+          <w:lang w:val="en-US"/>
+        </w:rPr>
+        <w:t>{{GRAPH_RMAX_ALPHA}}</w:t>
+      </w:r>
+    </w:p>
+    <w:p>
+      <w:pPr>
+        <w:rPr>
+          <w:rFonts w:ascii="Arial" w:hAnsi="Arial" w:cs="Arial"/>
+          <w:color w:val="1A1A1A"/>
+          <w:shd w:val="clear" w:color="auto" w:fill="FFFFFF"/>
+          <w:lang w:val="en-US"/>
+        </w:rPr>
+      </w:pPr>
+      <w:r>
+        <w:rPr>
+          <w:rFonts w:ascii="Arial" w:hAnsi="Arial" w:cs="Arial"/>
+          <w:color w:val="1A1A1A"/>
+          <w:lang w:val="en-US"/>
+        </w:rPr>
+        <w:br/>
+      </w:r>
+      <w:r>
+        <w:rPr>
+          <w:rFonts w:ascii="Arial" w:hAnsi="Arial" w:cs="Arial"/>
+          <w:color w:val="1A1A1A"/>
+          <w:shd w:val="clear" w:color="auto" w:fill="FFFFFF"/>
+          <w:lang w:val="en-US"/>
+        </w:rPr>
+        <w:t>{{GRAPH_RMAX_EPSILON}}</w:t>
+      </w:r>
+    </w:p>
+    <w:p>
+      <w:pPr>
+        <w:rPr>
+          <w:rFonts w:ascii="Arial" w:hAnsi="Arial" w:cs="Arial"/>
+          <w:color w:val="1A1A1A"/>
+          <w:shd w:val="clear" w:color="auto" w:fill="FFFFFF"/>
+          <w:lang w:val="en-US"/>
+        </w:rPr>
+      </w:pPr>
+      <w:r>
+        <w:rPr>
+          <w:rFonts w:ascii="Arial" w:hAnsi="Arial" w:cs="Arial"/>
+          <w:color w:val="1A1A1A"/>
+          <w:lang w:val="en-US"/>
+        </w:rPr>
+        <w:br/>
+      </w:r>
+      <w:r>
+        <w:rPr>
+          <w:rFonts w:ascii="Arial" w:hAnsi="Arial" w:cs="Arial"/>
+          <w:color w:val="1A1A1A"/>
+          <w:shd w:val="clear" w:color="auto" w:fill="FFFFFF"/>
+          <w:lang w:val="en-US"/>
+        </w:rPr>
+        <w:t>{{GRAPH_SELF_ALPHA}}</w:t>
+      </w:r>
+    </w:p>
+    <w:p>
+      <w:pPr>
+        <w:rPr>
+          <w:rFonts w:ascii="Arial" w:hAnsi="Arial" w:cs="Arial"/>
+          <w:color w:val="1A1A1A"/>
+          <w:shd w:val="clear" w:color="auto" w:fill="FFFFFF"/>
+          <w:lang w:val="en-US"/>
+        </w:rPr>
+      </w:pPr>
+      <w:r>
+        <w:rPr>
+          <w:rFonts w:ascii="Arial" w:hAnsi="Arial" w:cs="Arial"/>
+          <w:color w:val="1A1A1A"/>
+          <w:lang w:val="en-US"/>
+        </w:rPr>
+        <w:br/>
+      </w:r>
+      <w:r>
+        <w:rPr>
+          <w:rFonts w:ascii="Arial" w:hAnsi="Arial" w:cs="Arial"/>
+          <w:color w:val="1A1A1A"/>
+          <w:shd w:val="clear" w:color="auto" w:fill="FFFFFF"/>
+          <w:lang w:val="en-US"/>
+        </w:rPr>
+        <w:t>{{GRAPH_SELF_EPSILON}}</w:t>
+      </w:r>
+    </w:p>
+    <w:p>
+      <w:pPr>
+        <w:rPr>
+          <w:rFonts w:ascii="Arial" w:hAnsi="Arial" w:cs="Arial"/>
+          <w:color w:val="1A1A1A"/>
+          <w:shd w:val="clear" w:color="auto" w:fill="FFFFFF"/>
+          <w:lang w:val="en-US"/>
+        </w:rPr>
+      </w:pPr>
+      <w:r>
+        <w:rPr>
+          <w:rFonts w:ascii="Arial" w:hAnsi="Arial" w:cs="Arial"/>
+          <w:color w:val="1A1A1A"/>
+          <w:lang w:val="en-US"/>
+        </w:rPr>
+        <w:br/>
+      </w:r>
+      <w:r>
+        <w:rPr>
+          <w:rFonts w:ascii="Arial" w:hAnsi="Arial" w:cs="Arial"/>
+          <w:color w:val="1A1A1A"/>
+          <w:shd w:val="clear" w:color="auto" w:fill="FFFFFF"/>
+          <w:lang w:val="en-US"/>
+        </w:rPr>
+        <w:t>{{GRAPH_EXTERNAL_ALPHA}}</w:t>
+      </w:r>
+    </w:p>
+    <w:p>
+      <w:pPr>
+        <w:rPr>
+          <w:rFonts w:ascii="Arial" w:hAnsi="Arial" w:cs="Arial"/>
+          <w:color w:val="1A1A1A"/>
+          <w:shd w:val="clear" w:color="auto" w:fill="FFFFFF"/>
+          <w:lang w:val="en-US"/>
+        </w:rPr>
+      </w:pPr>
+      <w:r>
+        <w:rPr>
+          <w:rFonts w:ascii="Arial" w:hAnsi="Arial" w:cs="Arial"/>
+          <w:color w:val="1A1A1A"/>
+          <w:lang w:val="en-US"/>
+        </w:rPr>
+        <w:br/>
+      </w:r>
+      <w:r>
+        <w:rPr>
+          <w:rFonts w:ascii="Arial" w:hAnsi="Arial" w:cs="Arial"/>
+          <w:color w:val="1A1A1A"/>
+          <w:shd w:val="clear" w:color="auto" w:fill="FFFFFF"/>
+          <w:lang w:val="en-US"/>
+        </w:rPr>
+        <w:t>{{GRAPH_EXTERNAL_EPSILON}}</w:t>
+      </w:r>
+    </w:p>
+    <w:p>
+      <w:pPr>
+        <w:rPr>
+          <w:rFonts w:ascii="Arial" w:hAnsi="Arial" w:cs="Arial"/>
+          <w:color w:val="1A1A1A"/>
+          <w:shd w:val="clear" w:color="auto" w:fill="FFFFFF"/>
+          <w:lang w:val="en-US"/>
+        </w:rPr>
+      </w:pPr>
+    </w:p>
+    <w:p>
+      <w:pPr>
+        <w:rPr>
+          <w:rFonts w:ascii="Arial" w:hAnsi="Arial" w:cs="Arial"/>
+          <w:color w:val="1A1A1A"/>
+          <w:shd w:val="clear" w:color="auto" w:fill="FFFFFF"/>
+          <w:lang w:val="en-US"/>
+        </w:rPr>
+      </w:pPr>
+    </w:p>
+    <w:p>
+      <w:pPr>
+        <w:rPr>
+          <w:rFonts w:ascii="Arial" w:hAnsi="Arial" w:cs="Arial"/>
           <w:color w:val="1A1A1A"/>
           <w:shd w:val="clear" w:color="auto" w:fill="FFFFFF"/>
           <w:lang w:val="en-US"/>
@@ -2227,22 +2549,34 @@
           <w:color w:val="1A1A1A"/>
           <w:shd w:val="clear" w:color="auto" w:fill="FFFFFF"/>
         </w:rPr>
-        <w:t>выводы</w:t>
-      </w:r>
-    </w:p>
-    <w:p>
-      <w:pPr>
-        <w:rPr>
-          <w:rFonts w:ascii="Arial" w:hAnsi="Arial" w:cs="Arial"/>
-          <w:color w:val="1A1A1A"/>
-          <w:shd w:val="clear" w:color="auto" w:fill="FFFFFF"/>
-          <w:lang w:val="en-US"/>
-        </w:rPr>
-      </w:pPr>
-      <w:r>
-        <w:rPr>
-          <w:rFonts w:ascii="Arial" w:hAnsi="Arial" w:cs="Arial"/>
-          <w:color w:val="1A1A1A"/>
+        <w:t>результаты</w:t>
+      </w:r>
+      <w:r>
+        <w:rPr>
+          <w:rFonts w:ascii="Arial" w:hAnsi="Arial" w:cs="Arial"/>
+          <w:b/>
+          <w:bCs/>
+          <w:color w:val="1A1A1A"/>
+          <w:shd w:val="clear" w:color="auto" w:fill="FFFFFF"/>
+          <w:lang w:val="en-US"/>
+        </w:rPr>
+        <w:t xml:space="preserve"> </w:t>
+      </w:r>
+      <w:r>
+        <w:rPr>
+          <w:rFonts w:ascii="Arial" w:hAnsi="Arial" w:cs="Arial"/>
+          <w:b/>
+          <w:bCs/>
+          <w:color w:val="1A1A1A"/>
+          <w:shd w:val="clear" w:color="auto" w:fill="FFFFFF"/>
+        </w:rPr>
+        <w:t>расчёта</w:t>
+      </w:r>
+      <w:r>
+        <w:rPr>
+          <w:rFonts w:ascii="Arial" w:hAnsi="Arial" w:cs="Arial"/>
+          <w:color w:val="1A1A1A"/>
+          <w:shd w:val="clear" w:color="auto" w:fill="FFFFFF"/>
           <w:lang w:val="en-US"/>
         </w:rPr>
         <w:br/>
@@ -2254,6 +2588,65 @@
           <w:shd w:val="clear" w:color="auto" w:fill="FFFFFF"/>
           <w:lang w:val="en-US"/>
         </w:rPr>
+        <w:br/>
+        <w:t>{{RESULTS_TABLE}}</w:t>
+      </w:r>
+      <w:r>
+        <w:rPr>
+          <w:rFonts w:ascii="Arial" w:hAnsi="Arial" w:cs="Arial"/>
+          <w:color w:val="1A1A1A"/>
+          <w:shd w:val="clear" w:color="auto" w:fill="FFFFFF"/>
+          <w:lang w:val="en-US"/>
+        </w:rPr>
+        <w:br/>
+      </w:r>
+    </w:p>
+    <w:p>
+      <w:pPr>
+        <w:rPr>
+          <w:rFonts w:ascii="Arial" w:hAnsi="Arial" w:cs="Arial"/>
+          <w:color w:val="1A1A1A"/>
+          <w:shd w:val="clear" w:color="auto" w:fill="FFFFFF"/>
+          <w:lang w:val="en-US"/>
+        </w:rPr>
+      </w:pPr>
+      <w:r>
+        <w:rPr>
+          <w:rFonts w:ascii="Arial" w:hAnsi="Arial" w:cs="Arial"/>
+          <w:color w:val="1A1A1A"/>
+          <w:shd w:val="clear" w:color="auto" w:fill="FFFFFF"/>
+          <w:lang w:val="en-US"/>
+        </w:rPr>
+        <w:br/>
+      </w:r>
+      <w:r>
+        <w:rPr>
+          <w:rFonts w:ascii="Arial" w:hAnsi="Arial" w:cs="Arial"/>
+          <w:b/>
+          <w:bCs/>
+          <w:color w:val="1A1A1A"/>
+          <w:shd w:val="clear" w:color="auto" w:fill="FFFFFF"/>
+        </w:rPr>
+        <w:t>Заключение</w:t>
+      </w:r>
+      <w:r>
+        <w:rPr>
+          <w:rFonts w:ascii="Arial" w:hAnsi="Arial" w:cs="Arial"/>
+          <w:color w:val="1A1A1A"/>
+          <w:shd w:val="clear" w:color="auto" w:fill="FFFFFF"/>
+          <w:lang w:val="en-US"/>
+        </w:rPr>
+        <w:br/>
+      </w:r>
+      <w:r>
+        <w:rPr>
+          <w:rFonts w:ascii="Arial" w:hAnsi="Arial" w:cs="Arial"/>
+          <w:color w:val="1A1A1A"/>
+          <w:shd w:val="clear" w:color="auto" w:fill="FFFFFF"/>
+          <w:lang w:val="en-US"/>
+        </w:rPr>
+        <w:lastRenderedPageBreak/>
+        <w:br/>
         <w:t>{{CONCLUSION_CALC}}</w:t>
       </w:r>
     </w:p>
@@ -2266,219 +2659,45 @@
           <w:lang w:val="en-US"/>
         </w:rPr>
       </w:pPr>
-      <w:r>
-        <w:rPr>
-          <w:rFonts w:ascii="Arial" w:hAnsi="Arial" w:cs="Arial"/>
-          <w:color w:val="1A1A1A"/>
-          <w:lang w:val="en-US"/>
-        </w:rPr>
-        <w:br/>
-      </w:r>
-      <w:r>
-        <w:rPr>
-          <w:rFonts w:ascii="Arial" w:hAnsi="Arial" w:cs="Arial"/>
-          <w:color w:val="1A1A1A"/>
-          <w:lang w:val="en-US"/>
-        </w:rPr>
-        <w:br/>
-      </w:r>
-      <w:r>
-        <w:rPr>
-          <w:rFonts w:ascii="Arial" w:hAnsi="Arial" w:cs="Arial"/>
-          <w:color w:val="1A1A1A"/>
-          <w:shd w:val="clear" w:color="auto" w:fill="FFFFFF"/>
-          <w:lang w:val="en-US"/>
-        </w:rPr>
-        <w:t>{{GRAPH_DN_AZIMUTH}}</w:t>
-      </w:r>
-    </w:p>
-    <w:p>
-      <w:pPr>
-        <w:rPr>
-          <w:rFonts w:ascii="Arial" w:hAnsi="Arial" w:cs="Arial"/>
-          <w:color w:val="1A1A1A"/>
-          <w:shd w:val="clear" w:color="auto" w:fill="FFFFFF"/>
-          <w:lang w:val="en-US"/>
-        </w:rPr>
-      </w:pPr>
-      <w:r>
-        <w:rPr>
-          <w:rFonts w:ascii="Arial" w:hAnsi="Arial" w:cs="Arial"/>
-          <w:color w:val="1A1A1A"/>
-          <w:lang w:val="en-US"/>
-        </w:rPr>
-        <w:br/>
-      </w:r>
-      <w:r>
-        <w:rPr>
-          <w:rFonts w:ascii="Arial" w:hAnsi="Arial" w:cs="Arial"/>
-          <w:color w:val="1A1A1A"/>
-          <w:shd w:val="clear" w:color="auto" w:fill="FFFFFF"/>
-          <w:lang w:val="en-US"/>
-        </w:rPr>
-        <w:t>{{GRAPH_DN_ELEVATION}}</w:t>
-      </w:r>
-    </w:p>
-    <w:p>
-      <w:pPr>
-        <w:rPr>
-          <w:rFonts w:ascii="Arial" w:hAnsi="Arial" w:cs="Arial"/>
-          <w:color w:val="1A1A1A"/>
-          <w:shd w:val="clear" w:color="auto" w:fill="FFFFFF"/>
-          <w:lang w:val="en-US"/>
-        </w:rPr>
-      </w:pPr>
-      <w:r>
-        <w:rPr>
-          <w:rFonts w:ascii="Arial" w:hAnsi="Arial" w:cs="Arial"/>
-          <w:color w:val="1A1A1A"/>
-          <w:lang w:val="en-US"/>
-        </w:rPr>
-        <w:br/>
-      </w:r>
-      <w:r>
-        <w:rPr>
-          <w:rFonts w:ascii="Arial" w:hAnsi="Arial" w:cs="Arial"/>
-          <w:color w:val="1A1A1A"/>
-          <w:shd w:val="clear" w:color="auto" w:fill="FFFFFF"/>
-          <w:lang w:val="en-US"/>
-        </w:rPr>
-        <w:t>{{GRAPH_RMAX_ALPHA}}</w:t>
-      </w:r>
-    </w:p>
-    <w:p>
-      <w:pPr>
-        <w:rPr>
-          <w:rFonts w:ascii="Arial" w:hAnsi="Arial" w:cs="Arial"/>
-          <w:color w:val="1A1A1A"/>
-          <w:shd w:val="clear" w:color="auto" w:fill="FFFFFF"/>
-          <w:lang w:val="en-US"/>
-        </w:rPr>
-      </w:pPr>
-      <w:r>
-        <w:rPr>
-          <w:rFonts w:ascii="Arial" w:hAnsi="Arial" w:cs="Arial"/>
-          <w:color w:val="1A1A1A"/>
-          <w:lang w:val="en-US"/>
-        </w:rPr>
-        <w:br/>
-      </w:r>
-      <w:r>
-        <w:rPr>
-          <w:rFonts w:ascii="Arial" w:hAnsi="Arial" w:cs="Arial"/>
-          <w:color w:val="1A1A1A"/>
-          <w:shd w:val="clear" w:color="auto" w:fill="FFFFFF"/>
-          <w:lang w:val="en-US"/>
-        </w:rPr>
-        <w:t>{{GRAPH_RMAX_EPSILON}}</w:t>
-      </w:r>
-    </w:p>
-    <w:p>
-      <w:pPr>
-        <w:rPr>
-          <w:rFonts w:ascii="Arial" w:hAnsi="Arial" w:cs="Arial"/>
-          <w:color w:val="1A1A1A"/>
-          <w:shd w:val="clear" w:color="auto" w:fill="FFFFFF"/>
-          <w:lang w:val="en-US"/>
-        </w:rPr>
-      </w:pPr>
-      <w:r>
-        <w:rPr>
-          <w:rFonts w:ascii="Arial" w:hAnsi="Arial" w:cs="Arial"/>
-          <w:color w:val="1A1A1A"/>
-          <w:lang w:val="en-US"/>
-        </w:rPr>
-        <w:br/>
-      </w:r>
-      <w:r>
-        <w:rPr>
-          <w:rFonts w:ascii="Arial" w:hAnsi="Arial" w:cs="Arial"/>
-          <w:color w:val="1A1A1A"/>
-          <w:shd w:val="clear" w:color="auto" w:fill="FFFFFF"/>
-          <w:lang w:val="en-US"/>
-        </w:rPr>
-        <w:t>{{GRAPH_SELF_ALPHA}}</w:t>
-      </w:r>
-    </w:p>
-    <w:p>
-      <w:pPr>
-        <w:rPr>
-          <w:rFonts w:ascii="Arial" w:hAnsi="Arial" w:cs="Arial"/>
-          <w:color w:val="1A1A1A"/>
-          <w:shd w:val="clear" w:color="auto" w:fill="FFFFFF"/>
-          <w:lang w:val="en-US"/>
-        </w:rPr>
-      </w:pPr>
-      <w:r>
-        <w:rPr>
-          <w:rFonts w:ascii="Arial" w:hAnsi="Arial" w:cs="Arial"/>
-          <w:color w:val="1A1A1A"/>
-          <w:lang w:val="en-US"/>
-        </w:rPr>
-        <w:br/>
-      </w:r>
-      <w:r>
-        <w:rPr>
-          <w:rFonts w:ascii="Arial" w:hAnsi="Arial" w:cs="Arial"/>
-          <w:color w:val="1A1A1A"/>
-          <w:shd w:val="clear" w:color="auto" w:fill="FFFFFF"/>
-          <w:lang w:val="en-US"/>
-        </w:rPr>
-        <w:t>{{GRAPH_SELF_EPSILON}}</w:t>
-      </w:r>
-    </w:p>
-    <w:p>
-      <w:pPr>
-        <w:rPr>
-          <w:rFonts w:ascii="Arial" w:hAnsi="Arial" w:cs="Arial"/>
-          <w:color w:val="1A1A1A"/>
-          <w:shd w:val="clear" w:color="auto" w:fill="FFFFFF"/>
-          <w:lang w:val="en-US"/>
-        </w:rPr>
-      </w:pPr>
-      <w:r>
-        <w:rPr>
-          <w:rFonts w:ascii="Arial" w:hAnsi="Arial" w:cs="Arial"/>
-          <w:color w:val="1A1A1A"/>
-          <w:lang w:val="en-US"/>
-        </w:rPr>
-        <w:br/>
-      </w:r>
-      <w:r>
-        <w:rPr>
-          <w:rFonts w:ascii="Arial" w:hAnsi="Arial" w:cs="Arial"/>
-          <w:color w:val="1A1A1A"/>
-          <w:shd w:val="clear" w:color="auto" w:fill="FFFFFF"/>
-          <w:lang w:val="en-US"/>
-        </w:rPr>
-        <w:t>{{GRAPH_EXTERNAL_ALPHA}}</w:t>
-      </w:r>
-    </w:p>
-    <w:p>
-      <w:pPr>
-        <w:rPr>
-          <w:sz w:val="28"/>
-          <w:szCs w:val="28"/>
-          <w:lang w:val="en-US"/>
-        </w:rPr>
-      </w:pPr>
-      <w:r>
-        <w:rPr>
-          <w:rFonts w:ascii="Arial" w:hAnsi="Arial" w:cs="Arial"/>
-          <w:color w:val="1A1A1A"/>
-          <w:lang w:val="en-US"/>
-        </w:rPr>
-        <w:br/>
-      </w:r>
-      <w:r>
-        <w:rPr>
-          <w:rFonts w:ascii="Arial" w:hAnsi="Arial" w:cs="Arial"/>
-          <w:color w:val="1A1A1A"/>
-          <w:shd w:val="clear" w:color="auto" w:fill="FFFFFF"/>
-          <w:lang w:val="en-US"/>
-        </w:rPr>
-        <w:t>{{GRAPH_EXTERNAL_EPSILON}}</w:t>
-      </w:r>
+    </w:p>
+    <w:p>
+      <w:pPr>
+        <w:rPr>
+          <w:rFonts w:ascii="Arial" w:hAnsi="Arial" w:cs="Arial"/>
+          <w:color w:val="1A1A1A"/>
+          <w:shd w:val="clear" w:color="auto" w:fill="FFFFFF"/>
+          <w:lang w:val="en-US"/>
+        </w:rPr>
+      </w:pPr>
+    </w:p>
+    <w:p>
+      <w:pPr>
+        <w:rPr>
+          <w:rFonts w:ascii="Arial" w:hAnsi="Arial" w:cs="Arial"/>
+          <w:color w:val="1A1A1A"/>
+          <w:shd w:val="clear" w:color="auto" w:fill="FFFFFF"/>
+          <w:lang w:val="en-US"/>
+        </w:rPr>
+      </w:pPr>
+    </w:p>
+    <w:p>
+      <w:pPr>
+        <w:rPr>
+          <w:rFonts w:ascii="Arial" w:hAnsi="Arial" w:cs="Arial"/>
+          <w:color w:val="1A1A1A"/>
+          <w:shd w:val="clear" w:color="auto" w:fill="FFFFFF"/>
+          <w:lang w:val="en-US"/>
+        </w:rPr>
+      </w:pPr>
+    </w:p>
+    <w:p>
+      <w:pPr>
+        <w:rPr>
+          <w:sz w:val="28"/>
+          <w:szCs w:val="28"/>
+          <w:lang w:val="en-US"/>
+        </w:rPr>
+      </w:pPr>
     </w:p>
     <w:sectPr>
       <w:headerReference w:type="even" r:id="rId7"/>

</xml_diff>